<commit_message>
docs: ajouter la question des locations simultanées au récap client
Découverte pendant le cadrage technique interne : le comportement
n'est pas encore défini si un client peut avoir plusieurs locations
actives en même temps.

Co-Authored-By: Claude Sonnet 5 <noreply@anthropic.com>
</commit_message>
<xml_diff>
--- a/docs/projet-plateforme-location/questions-recap-a-envoyer.docx
+++ b/docs/projet-plateforme-location/questions-recap-a-envoyer.docx
@@ -1120,7 +1120,6 @@
           <w:ilvl w:val="0"/>
           <w:numId w:val="12"/>
         </w:numPr>
-        <w:spacing w:before="0" w:after="200"/>
         <w:rPr/>
       </w:pPr>
       <w:r>
@@ -1129,6 +1128,24 @@
           <w:color w:val="C00000"/>
         </w:rPr>
         <w:t>Délai minimum entre réservation et retrait.</w:t>
+      </w:r>
+    </w:p>
+    <w:p>
+      <w:pPr>
+        <w:pStyle w:val="Normal"/>
+        <w:numPr>
+          <w:ilvl w:val="0"/>
+          <w:numId w:val="12"/>
+        </w:numPr>
+        <w:spacing w:before="0" w:after="200"/>
+        <w:rPr/>
+      </w:pPr>
+      <w:r>
+        <w:rPr>
+          <w:b/>
+          <w:color w:val="C00000"/>
+        </w:rPr>
+        <w:t>Un client peut-il avoir plusieurs locations en cours en même temps (plusieurs sets réservés simultanément), ou une seule location active à la fois par client ?</w:t>
       </w:r>
     </w:p>
     <w:p>

</xml_diff>

<commit_message>
docs: ajouter la question de la pré-autorisation caution en paiement TPE
Point identifié lors de la rédaction de la spécification fonctionnelle :
le mécanisme de caution n'est pas défini quand le client paie sur place
par TPE plutôt qu'en ligne.

Co-Authored-By: Claude Sonnet 5 <noreply@anthropic.com>
</commit_message>
<xml_diff>
--- a/docs/projet-plateforme-location/questions-recap-a-envoyer.docx
+++ b/docs/projet-plateforme-location/questions-recap-a-envoyer.docx
@@ -1137,7 +1137,6 @@
           <w:ilvl w:val="0"/>
           <w:numId w:val="12"/>
         </w:numPr>
-        <w:spacing w:before="0" w:after="200"/>
         <w:rPr/>
       </w:pPr>
       <w:r>
@@ -1146,6 +1145,24 @@
           <w:color w:val="C00000"/>
         </w:rPr>
         <w:t>Un client peut-il avoir plusieurs locations en cours en même temps (plusieurs sets réservés simultanément), ou une seule location active à la fois par client ?</w:t>
+      </w:r>
+    </w:p>
+    <w:p>
+      <w:pPr>
+        <w:pStyle w:val="Normal"/>
+        <w:numPr>
+          <w:ilvl w:val="0"/>
+          <w:numId w:val="12"/>
+        </w:numPr>
+        <w:spacing w:before="0" w:after="200"/>
+        <w:rPr/>
+      </w:pPr>
+      <w:r>
+        <w:rPr>
+          <w:b/>
+          <w:color w:val="C00000"/>
+        </w:rPr>
+        <w:t>Si un client choisit de payer sur place par TPE au moment de la remise, faut-il quand même enregistrer sa carte en amont pour la pré-autorisation de la caution, ou la caution est-elle prise directement sur place via le TPE ?</w:t>
       </w:r>
     </w:p>
     <w:p>

</xml_diff>